<commit_message>
Updated opioid descriptive analysis
</commit_message>
<xml_diff>
--- a/tables/Opioid_Descriptive_Analyses.docx
+++ b/tables/Opioid_Descriptive_Analyses.docx
@@ -3542,6 +3542,140 @@
                 <w:sz w:val="20"/>
               </w:rPr>
               <w:t>0 (0%)</w:t>
+            </w:r>
+          </w:p>
+        </w:tc>
+      </w:tr>
+      <w:tr>
+        <w:tc>
+          <w:tcPr>
+            <w:tcW w:type="dxa" w:w="3888"/>
+            <w:vAlign w:val="center"/>
+            <w:tcBorders>
+              <w:top w:val="single" w:sz="4" w:color="BFBFBF"/>
+              <w:left w:val="single" w:sz="4" w:color="BFBFBF"/>
+              <w:bottom w:val="single" w:sz="4" w:color="BFBFBF"/>
+              <w:right w:val="single" w:sz="4" w:color="BFBFBF"/>
+            </w:tcBorders>
+            <w:tcMar>
+              <w:top w:w="80" w:type="dxa"/>
+              <w:left w:w="120" w:type="dxa"/>
+              <w:bottom w:w="80" w:type="dxa"/>
+              <w:right w:w="120" w:type="dxa"/>
+            </w:tcMar>
+          </w:tcPr>
+          <w:p>
+            <w:pPr>
+              <w:jc w:val="left"/>
+            </w:pPr>
+            <w:r/>
+            <w:r>
+              <w:rPr>
+                <w:rFonts w:ascii="Arial" w:hAnsi="Arial"/>
+                <w:b w:val="0"/>
+                <w:i w:val="0"/>
+                <w:sz w:val="20"/>
+              </w:rPr>
+              <w:t xml:space="preserve">    Ibogaine</w:t>
+            </w:r>
+          </w:p>
+        </w:tc>
+        <w:tc>
+          <w:tcPr>
+            <w:tcW w:type="dxa" w:w="1872"/>
+            <w:vAlign w:val="center"/>
+            <w:tcBorders>
+              <w:top w:val="single" w:sz="4" w:color="BFBFBF"/>
+              <w:left w:val="single" w:sz="4" w:color="BFBFBF"/>
+              <w:bottom w:val="single" w:sz="4" w:color="BFBFBF"/>
+              <w:right w:val="single" w:sz="4" w:color="BFBFBF"/>
+            </w:tcBorders>
+            <w:tcMar>
+              <w:top w:w="80" w:type="dxa"/>
+              <w:left w:w="120" w:type="dxa"/>
+              <w:bottom w:w="80" w:type="dxa"/>
+              <w:right w:w="120" w:type="dxa"/>
+            </w:tcMar>
+          </w:tcPr>
+          <w:p>
+            <w:pPr>
+              <w:jc w:val="center"/>
+            </w:pPr>
+            <w:r/>
+            <w:r>
+              <w:rPr>
+                <w:rFonts w:ascii="Arial" w:hAnsi="Arial"/>
+                <w:b w:val="0"/>
+                <w:i w:val="0"/>
+                <w:sz w:val="20"/>
+              </w:rPr>
+              <w:t>4 (57%)</w:t>
+            </w:r>
+          </w:p>
+        </w:tc>
+        <w:tc>
+          <w:tcPr>
+            <w:tcW w:type="dxa" w:w="1872"/>
+            <w:vAlign w:val="center"/>
+            <w:tcBorders>
+              <w:top w:val="single" w:sz="4" w:color="BFBFBF"/>
+              <w:left w:val="single" w:sz="4" w:color="BFBFBF"/>
+              <w:bottom w:val="single" w:sz="4" w:color="BFBFBF"/>
+              <w:right w:val="single" w:sz="4" w:color="BFBFBF"/>
+            </w:tcBorders>
+            <w:tcMar>
+              <w:top w:w="80" w:type="dxa"/>
+              <w:left w:w="120" w:type="dxa"/>
+              <w:bottom w:w="80" w:type="dxa"/>
+              <w:right w:w="120" w:type="dxa"/>
+            </w:tcMar>
+          </w:tcPr>
+          <w:p>
+            <w:pPr>
+              <w:jc w:val="center"/>
+            </w:pPr>
+            <w:r/>
+            <w:r>
+              <w:rPr>
+                <w:rFonts w:ascii="Arial" w:hAnsi="Arial"/>
+                <w:b w:val="0"/>
+                <w:i w:val="0"/>
+                <w:sz w:val="20"/>
+              </w:rPr>
+              <w:t>0 (0%)</w:t>
+            </w:r>
+          </w:p>
+        </w:tc>
+        <w:tc>
+          <w:tcPr>
+            <w:tcW w:type="dxa" w:w="1872"/>
+            <w:vAlign w:val="center"/>
+            <w:tcBorders>
+              <w:top w:val="single" w:sz="4" w:color="BFBFBF"/>
+              <w:left w:val="single" w:sz="4" w:color="BFBFBF"/>
+              <w:bottom w:val="single" w:sz="4" w:color="BFBFBF"/>
+              <w:right w:val="single" w:sz="4" w:color="BFBFBF"/>
+            </w:tcBorders>
+            <w:tcMar>
+              <w:top w:w="80" w:type="dxa"/>
+              <w:left w:w="120" w:type="dxa"/>
+              <w:bottom w:w="80" w:type="dxa"/>
+              <w:right w:w="120" w:type="dxa"/>
+            </w:tcMar>
+          </w:tcPr>
+          <w:p>
+            <w:pPr>
+              <w:jc w:val="center"/>
+            </w:pPr>
+            <w:r/>
+            <w:r>
+              <w:rPr>
+                <w:rFonts w:ascii="Arial" w:hAnsi="Arial"/>
+                <w:b w:val="0"/>
+                <w:i w:val="0"/>
+                <w:sz w:val="20"/>
+              </w:rPr>
+              <w:t>2 (100%)</w:t>
             </w:r>
           </w:p>
         </w:tc>

</xml_diff>